<commit_message>
Add Milestone 2 and Milestone 3
</commit_message>
<xml_diff>
--- a/docs/Milestone 2/CivicConnect_PED_v2.docx
+++ b/docs/Milestone 2/CivicConnect_PED_v2.docx
@@ -352,7 +352,7 @@
                                 <w:szCs w:val="28"/>
                                 <w:lang w:val="en-ZA"/>
                               </w:rPr>
-                              <w:t>Armand Johannes Vermeulen 602636</w:t>
+                              <w:t xml:space="preserve"> Person 1</w:t>
                             </w:r>
                             <w:r>
                               <w:rPr>
@@ -361,7 +361,28 @@
                                 <w:szCs w:val="28"/>
                                 <w:lang w:val="en-ZA"/>
                               </w:rPr>
-                              <w:br/>
+                              <w:t>Riegardt Christopher Weich 602547</w:t>
+                            </w:r>
+                          </w:p>
+                          <w:p>
+                            <w:pPr>
+                              <w:pStyle w:val="NoSpacing"/>
+                              <w:jc w:val="right"/>
+                              <w:rPr>
+                                <w:color w:val="595959" w:themeColor="text1" w:themeTint="A6"/>
+                                <w:sz w:val="28"/>
+                                <w:szCs w:val="28"/>
+                                <w:lang w:val="en-ZA"/>
+                              </w:rPr>
+                            </w:pPr>
+                            <w:r>
+                              <w:rPr>
+                                <w:color w:val="595959" w:themeColor="text1" w:themeTint="A6"/>
+                                <w:sz w:val="28"/>
+                                <w:szCs w:val="28"/>
+                                <w:lang w:val="en-ZA"/>
+                              </w:rPr>
+                              <w:t xml:space="preserve">Person 2 </w:t>
                             </w:r>
                             <w:proofErr w:type="spellStart"/>
                             <w:r>
@@ -415,7 +436,6 @@
                                 <w:lang w:val="en-ZA"/>
                               </w:rPr>
                             </w:pPr>
-                            <w:proofErr w:type="spellStart"/>
                             <w:r>
                               <w:rPr>
                                 <w:color w:val="595959" w:themeColor="text1" w:themeTint="A6"/>
@@ -423,9 +443,8 @@
                                 <w:szCs w:val="28"/>
                                 <w:lang w:val="en-ZA"/>
                               </w:rPr>
-                              <w:t>Riegardt</w:t>
+                              <w:t xml:space="preserve">Person 3 </w:t>
                             </w:r>
-                            <w:proofErr w:type="spellEnd"/>
                             <w:r>
                               <w:rPr>
                                 <w:color w:val="595959" w:themeColor="text1" w:themeTint="A6"/>
@@ -433,20 +452,8 @@
                                 <w:szCs w:val="28"/>
                                 <w:lang w:val="en-ZA"/>
                               </w:rPr>
-                              <w:t xml:space="preserve"> Christopher Weich 602547</w:t>
+                              <w:t>Armand Johannes Vermeulen 602636</w:t>
                             </w:r>
-                          </w:p>
-                          <w:p>
-                            <w:pPr>
-                              <w:pStyle w:val="NoSpacing"/>
-                              <w:jc w:val="right"/>
-                              <w:rPr>
-                                <w:color w:val="595959" w:themeColor="text1" w:themeTint="A6"/>
-                                <w:sz w:val="28"/>
-                                <w:szCs w:val="28"/>
-                                <w:lang w:val="en-ZA"/>
-                              </w:rPr>
-                            </w:pPr>
                           </w:p>
                           <w:p>
                             <w:pPr>
@@ -534,7 +541,7 @@
                           <w:szCs w:val="28"/>
                           <w:lang w:val="en-ZA"/>
                         </w:rPr>
-                        <w:t>Armand Johannes Vermeulen 602636</w:t>
+                        <w:t xml:space="preserve"> Person 1</w:t>
                       </w:r>
                       <w:r>
                         <w:rPr>
@@ -543,7 +550,28 @@
                           <w:szCs w:val="28"/>
                           <w:lang w:val="en-ZA"/>
                         </w:rPr>
-                        <w:br/>
+                        <w:t>Riegardt Christopher Weich 602547</w:t>
+                      </w:r>
+                    </w:p>
+                    <w:p>
+                      <w:pPr>
+                        <w:pStyle w:val="NoSpacing"/>
+                        <w:jc w:val="right"/>
+                        <w:rPr>
+                          <w:color w:val="595959" w:themeColor="text1" w:themeTint="A6"/>
+                          <w:sz w:val="28"/>
+                          <w:szCs w:val="28"/>
+                          <w:lang w:val="en-ZA"/>
+                        </w:rPr>
+                      </w:pPr>
+                      <w:r>
+                        <w:rPr>
+                          <w:color w:val="595959" w:themeColor="text1" w:themeTint="A6"/>
+                          <w:sz w:val="28"/>
+                          <w:szCs w:val="28"/>
+                          <w:lang w:val="en-ZA"/>
+                        </w:rPr>
+                        <w:t xml:space="preserve">Person 2 </w:t>
                       </w:r>
                       <w:proofErr w:type="spellStart"/>
                       <w:r>
@@ -597,7 +625,6 @@
                           <w:lang w:val="en-ZA"/>
                         </w:rPr>
                       </w:pPr>
-                      <w:proofErr w:type="spellStart"/>
                       <w:r>
                         <w:rPr>
                           <w:color w:val="595959" w:themeColor="text1" w:themeTint="A6"/>
@@ -605,9 +632,8 @@
                           <w:szCs w:val="28"/>
                           <w:lang w:val="en-ZA"/>
                         </w:rPr>
-                        <w:t>Riegardt</w:t>
+                        <w:t xml:space="preserve">Person 3 </w:t>
                       </w:r>
-                      <w:proofErr w:type="spellEnd"/>
                       <w:r>
                         <w:rPr>
                           <w:color w:val="595959" w:themeColor="text1" w:themeTint="A6"/>
@@ -615,20 +641,8 @@
                           <w:szCs w:val="28"/>
                           <w:lang w:val="en-ZA"/>
                         </w:rPr>
-                        <w:t xml:space="preserve"> Christopher Weich 602547</w:t>
+                        <w:t>Armand Johannes Vermeulen 602636</w:t>
                       </w:r>
-                    </w:p>
-                    <w:p>
-                      <w:pPr>
-                        <w:pStyle w:val="NoSpacing"/>
-                        <w:jc w:val="right"/>
-                        <w:rPr>
-                          <w:color w:val="595959" w:themeColor="text1" w:themeTint="A6"/>
-                          <w:sz w:val="28"/>
-                          <w:szCs w:val="28"/>
-                          <w:lang w:val="en-ZA"/>
-                        </w:rPr>
-                      </w:pPr>
                     </w:p>
                     <w:p>
                       <w:pPr>
@@ -4608,7 +4622,7 @@
           <w:noProof/>
         </w:rPr>
         <w:drawing>
-          <wp:inline distT="0" distB="0" distL="0" distR="0" wp14:anchorId="67301EE4" wp14:editId="1E016958">
+          <wp:inline distT="0" distB="0" distL="0" distR="0" wp14:anchorId="67301EE4" wp14:editId="4EDBFF01">
             <wp:extent cx="5525770" cy="8206105"/>
             <wp:effectExtent l="0" t="0" r="0" b="4445"/>
             <wp:docPr id="2096276402" name="Picture 1"/>

</xml_diff>